<commit_message>
Debounce the Week 07 Task 3 button and react on the rising edge
Co-Authored-By: Claude Opus 5.5 <noreply@anthropic.com>
Claude-Session: https://claude.ai/code/session_016jtnPXZmxWKhq11ysF7ez7
</commit_message>
<xml_diff>
--- a/W07/W07 LAB State Machines and the LCD Display.docx
+++ b/W07/W07 LAB State Machines and the LCD Display.docx
@@ -3589,7 +3589,7 @@
       </w:r>
       <w:r>
         <w:rPr/>
-        <w:t xml:space="preserve"> the cars’ light stays GREEN until the button is pressed, then goes YELLOW → WALK (countdown) → CLEAR → GREEN. The sketch uses </w:t>
+        <w:t xml:space="preserve"> the cars’ light stays GREEN until the button is pressed and released, then goes YELLOW → WALK (countdown) → CLEAR → GREEN. The sketch uses </w:t>
       </w:r>
       <w:r>
         <w:rPr>
@@ -3617,7 +3617,18 @@
       </w:r>
       <w:r>
         <w:rPr/>
-        <w:t xml:space="preserve">.</w:t>
+        <w:t xml:space="preserve">, and the button is debounced and reacts on the </w:t>
+      </w:r>
+      <w:r>
+        <w:rPr>
+          <w:b/>
+          <w:bCs/>
+        </w:rPr>
+        <w:t xml:space="preserve">rising edge</w:t>
+      </w:r>
+      <w:r>
+        <w:rPr/>
+        <w:t xml:space="preserve"> (when it is released).</w:t>
       </w:r>
     </w:p>
     <w:p>
@@ -4319,7 +4330,7 @@
       </w:r>
       <w:r>
         <w:rPr/>
-        <w:t xml:space="preserve"> the light stays GREEN until you press the button; the LCD shows </w:t>
+        <w:t xml:space="preserve"> the light stays GREEN until you press and release the button; the LCD shows </w:t>
       </w:r>
       <w:r>
         <w:rPr>
@@ -4485,7 +4496,7 @@
                 <w:sz w:val="17"/>
                 <w:szCs w:val="17"/>
               </w:rPr>
-              <w:t xml:space="preserve">Button pressed</w:t>
+              <w:t xml:space="preserve">Button released</w:t>
             </w:r>
           </w:p>
           <w:p>
@@ -4575,7 +4586,7 @@
       </w:pPr>
       <w:r>
         <w:rPr/>
-        <w:t xml:space="preserve">Press the button at each of the times below. Use the state diagram to explain each result.</w:t>
+        <w:t xml:space="preserve">Press and release the button at each of the times below. Use the state diagram to explain each result.</w:t>
       </w:r>
     </w:p>
     <w:tbl>
@@ -4625,7 +4636,7 @@
                 <w:sz w:val="19"/>
                 <w:szCs w:val="19"/>
               </w:rPr>
-              <w:t xml:space="preserve">When you press</w:t>
+              <w:t xml:space="preserve">When you press and release</w:t>
             </w:r>
           </w:p>
         </w:tc>
@@ -5061,16 +5072,16 @@
           <w:b/>
           <w:bCs/>
         </w:rPr>
-        <w:t xml:space="preserve">3d  No debouncing needed</w:t>
-      </w:r>
-    </w:p>
-    <w:p>
-      <w:pPr>
-        <w:spacing w:after="120" w:line="264" w:lineRule="auto"/>
+        <w:t xml:space="preserve">3d  Rising edge and debouncing</w:t>
+      </w:r>
+    </w:p>
+    <w:p>
+      <w:pPr>
+        <w:spacing w:after="60" w:line="264" w:lineRule="auto"/>
       </w:pPr>
       <w:r>
         <w:rPr/>
-        <w:t xml:space="preserve">One press of a mechanical button can read as several quick presses. Why does that not cause a problem here? (Hint: what does a second press do to </w:t>
+        <w:t xml:space="preserve">1. Press the button and keep holding it. When does </w:t>
       </w:r>
       <w:r>
         <w:rPr>
@@ -5080,11 +5091,85 @@
           <w:szCs w:val="20"/>
           <w:shd w:val="clear" w:color="auto" w:fill="F4F4F4"/>
         </w:rPr>
-        <w:t xml:space="preserve">walkRequested</w:t>
+        <w:t xml:space="preserve">WAIT...</w:t>
       </w:r>
       <w:r>
         <w:rPr/>
-        <w:t xml:space="preserve">?)</w:t>
+        <w:t xml:space="preserve"> appear: when you press, or when you let go? Which edge of the D2 signal (rising or falling) is the sketch reacting to?</w:t>
+      </w:r>
+    </w:p>
+    <w:p>
+      <w:pPr>
+        <w:spacing w:after="60" w:line="264" w:lineRule="auto"/>
+      </w:pPr>
+      <w:r>
+        <w:rPr/>
+        <w:t xml:space="preserve">2. In </w:t>
+      </w:r>
+      <w:r>
+        <w:rPr>
+          <w:rFonts w:ascii="Consolas" w:hAnsi="Consolas" w:cs="Consolas"/>
+          <w:color w:val="C7254E"/>
+          <w:sz w:val="20"/>
+          <w:szCs w:val="20"/>
+          <w:shd w:val="clear" w:color="auto" w:fill="F4F4F4"/>
+        </w:rPr>
+        <w:t xml:space="preserve">buttonReleased()</w:t>
+      </w:r>
+      <w:r>
+        <w:rPr/>
+        <w:t xml:space="preserve">, a new reading only counts once it has stayed the same for </w:t>
+      </w:r>
+      <w:r>
+        <w:rPr>
+          <w:rFonts w:ascii="Consolas" w:hAnsi="Consolas" w:cs="Consolas"/>
+          <w:color w:val="C7254E"/>
+          <w:sz w:val="20"/>
+          <w:szCs w:val="20"/>
+          <w:shd w:val="clear" w:color="auto" w:fill="F4F4F4"/>
+        </w:rPr>
+        <w:t xml:space="preserve">DEBOUNCE_TIME</w:t>
+      </w:r>
+      <w:r>
+        <w:rPr/>
+        <w:t xml:space="preserve"> (50 ms). Why is this needed for a mechanical button?</w:t>
+      </w:r>
+    </w:p>
+    <w:p>
+      <w:pPr>
+        <w:spacing w:after="60" w:line="264" w:lineRule="auto"/>
+      </w:pPr>
+      <w:r>
+        <w:rPr/>
+        <w:t xml:space="preserve">3. Set </w:t>
+      </w:r>
+      <w:r>
+        <w:rPr>
+          <w:rFonts w:ascii="Consolas" w:hAnsi="Consolas" w:cs="Consolas"/>
+          <w:color w:val="C7254E"/>
+          <w:sz w:val="20"/>
+          <w:szCs w:val="20"/>
+          <w:shd w:val="clear" w:color="auto" w:fill="F4F4F4"/>
+        </w:rPr>
+        <w:t xml:space="preserve">DEBOUNCE_TIME</w:t>
+      </w:r>
+      <w:r>
+        <w:rPr/>
+        <w:t xml:space="preserve"> to </w:t>
+      </w:r>
+      <w:r>
+        <w:rPr>
+          <w:rFonts w:ascii="Consolas" w:hAnsi="Consolas" w:cs="Consolas"/>
+          <w:color w:val="C7254E"/>
+          <w:sz w:val="20"/>
+          <w:szCs w:val="20"/>
+          <w:shd w:val="clear" w:color="auto" w:fill="F4F4F4"/>
+        </w:rPr>
+        <w:t xml:space="preserve">0</w:t>
+      </w:r>
+      <w:r>
+        <w:rPr/>
+        <w:t xml:space="preserve"> and press the button several times. Does anything change? Would it matter if the button started a different action on every press, such as counting pedestrians?</w:t>
       </w:r>
     </w:p>
     <w:tbl>

</xml_diff>

<commit_message>
Add the RGB LCD shield wiring diagram to the Week 07 lab
Co-Authored-By: Claude Opus 5.5 <noreply@anthropic.com>
Claude-Session: https://claude.ai/code/session_016jtnPXZmxWKhq11ysF7ez7
</commit_message>
<xml_diff>
--- a/W07/W07 LAB State Machines and the LCD Display.docx
+++ b/W07/W07 LAB State Machines and the LCD Display.docx
@@ -214,6 +214,175 @@
     <w:p>
       <w:pPr>
         <w:spacing w:after="80"/>
+        <w:rPr>
+          <w:sz w:val="8"/>
+        </w:rPr>
+      </w:pPr>
+    </w:p>
+    <w:tbl>
+      <w:tblPr>
+        <w:tblW w:w="9706" w:type="dxa"/>
+        <w:tblLayout w:type="fixed"/>
+        <w:tblLook w:val="04A0" w:firstRow="1" w:lastRow="0" w:firstColumn="1" w:lastColumn="0" w:noHBand="0" w:noVBand="1"/>
+      </w:tblPr>
+      <w:tblGrid>
+        <w:gridCol w:w="9706"/>
+      </w:tblGrid>
+      <w:tr>
+        <w:trPr>
+          <w:cantSplit/>
+        </w:trPr>
+        <w:tc>
+          <w:tcPr>
+            <w:tcW w:w="9706" w:type="dxa"/>
+            <w:tcMar>
+              <w:top w:w="60" w:type="dxa"/>
+              <w:left w:w="100" w:type="dxa"/>
+              <w:bottom w:w="60" w:type="dxa"/>
+              <w:right w:w="100" w:type="dxa"/>
+            </w:tcMar>
+            <w:vAlign w:val="bottom"/>
+          </w:tcPr>
+          <w:p>
+            <w:pPr>
+              <w:spacing w:after="40" w:line="264" w:lineRule="auto"/>
+              <w:jc w:val="center"/>
+            </w:pPr>
+            <w:r>
+              <w:rPr>
+                <w:noProof/>
+              </w:rPr>
+              <w:drawing>
+                <wp:inline distT="0" distB="0" distL="0" distR="0">
+                  <wp:extent cx="5854850" cy="2250205"/>
+                  <wp:effectExtent l="0" t="0" r="0" b="0"/>
+                  <wp:docPr id="501" name="Figure 1"/>
+                  <wp:cNvGraphicFramePr>
+                    <a:graphicFrameLocks xmlns:a="http://schemas.openxmlformats.org/drawingml/2006/main" noChangeAspect="1"/>
+                  </wp:cNvGraphicFramePr>
+                  <a:graphic xmlns:a="http://schemas.openxmlformats.org/drawingml/2006/main">
+                    <a:graphicData uri="http://schemas.openxmlformats.org/drawingml/2006/picture">
+                      <pic:pic xmlns:pic="http://schemas.openxmlformats.org/drawingml/2006/picture">
+                        <pic:nvPicPr>
+                          <pic:cNvPr id="501" name="fig00_rgb_shield_wiring.png"/>
+                          <pic:cNvPicPr/>
+                        </pic:nvPicPr>
+                        <pic:blipFill>
+                          <a:blip r:embed="rIdImg1"/>
+                          <a:stretch>
+                            <a:fillRect/>
+                          </a:stretch>
+                        </pic:blipFill>
+                        <pic:spPr>
+                          <a:xfrm>
+                            <a:off x="0" y="0"/>
+                            <a:ext cx="5854850" cy="2250205"/>
+                          </a:xfrm>
+                          <a:prstGeom prst="rect">
+                            <a:avLst/>
+                          </a:prstGeom>
+                        </pic:spPr>
+                      </pic:pic>
+                    </a:graphicData>
+                  </a:graphic>
+                </wp:inline>
+              </w:drawing>
+            </w:r>
+          </w:p>
+          <w:p>
+            <w:pPr>
+              <w:spacing w:line="264" w:lineRule="auto"/>
+              <w:jc w:val="center"/>
+            </w:pPr>
+            <w:r>
+              <w:rPr>
+                <w:b/>
+                <w:bCs/>
+                <w:color w:val="595959"/>
+                <w:sz w:val="18"/>
+                <w:szCs w:val="18"/>
+              </w:rPr>
+              <w:t xml:space="preserve">Figure 1: </w:t>
+            </w:r>
+            <w:r>
+              <w:rPr>
+                <w:color w:val="595959"/>
+                <w:sz w:val="18"/>
+                <w:szCs w:val="18"/>
+              </w:rPr>
+              <w:t xml:space="preserve">Adafruit RGB LCD shield wiring: </w:t>
+            </w:r>
+            <w:r>
+              <w:rPr>
+                <w:b/>
+                <w:bCs/>
+                <w:color w:val="595959"/>
+                <w:sz w:val="18"/>
+                <w:szCs w:val="18"/>
+              </w:rPr>
+              <w:t xml:space="preserve">5V</w:t>
+            </w:r>
+            <w:r>
+              <w:rPr>
+                <w:color w:val="595959"/>
+                <w:sz w:val="18"/>
+                <w:szCs w:val="18"/>
+              </w:rPr>
+              <w:t xml:space="preserve">, </w:t>
+            </w:r>
+            <w:r>
+              <w:rPr>
+                <w:b/>
+                <w:bCs/>
+                <w:color w:val="595959"/>
+                <w:sz w:val="18"/>
+                <w:szCs w:val="18"/>
+              </w:rPr>
+              <w:t xml:space="preserve">GND</w:t>
+            </w:r>
+            <w:r>
+              <w:rPr>
+                <w:color w:val="595959"/>
+                <w:sz w:val="18"/>
+                <w:szCs w:val="18"/>
+              </w:rPr>
+              <w:t xml:space="preserve">, </w:t>
+            </w:r>
+            <w:r>
+              <w:rPr>
+                <w:b/>
+                <w:bCs/>
+                <w:color w:val="595959"/>
+                <w:sz w:val="18"/>
+                <w:szCs w:val="18"/>
+              </w:rPr>
+              <w:t xml:space="preserve">SDA → A4</w:t>
+            </w:r>
+            <w:r>
+              <w:rPr>
+                <w:color w:val="595959"/>
+                <w:sz w:val="18"/>
+                <w:szCs w:val="18"/>
+              </w:rPr>
+              <w:t xml:space="preserve"> and </w:t>
+            </w:r>
+            <w:r>
+              <w:rPr>
+                <w:b/>
+                <w:bCs/>
+                <w:color w:val="595959"/>
+                <w:sz w:val="18"/>
+                <w:szCs w:val="18"/>
+              </w:rPr>
+              <w:t xml:space="preserve">SCL → A5</w:t>
+            </w:r>
+          </w:p>
+        </w:tc>
+      </w:tr>
+    </w:tbl>
+    <w:p>
+      <w:pPr>
+        <w:spacing w:after="84"/>
         <w:rPr>
           <w:sz w:val="8"/>
         </w:rPr>
@@ -917,7 +1086,7 @@
                 <wp:inline distT="0" distB="0" distL="0" distR="0">
                   <wp:extent cx="4437360" cy="3224019"/>
                   <wp:effectExtent l="0" t="0" r="0" b="0"/>
-                  <wp:docPr id="501" name="Figure 1"/>
+                  <wp:docPr id="502" name="Figure 2"/>
                   <wp:cNvGraphicFramePr>
                     <a:graphicFrameLocks xmlns:a="http://schemas.openxmlformats.org/drawingml/2006/main" noChangeAspect="1"/>
                   </wp:cNvGraphicFramePr>
@@ -925,11 +1094,11 @@
                     <a:graphicData uri="http://schemas.openxmlformats.org/drawingml/2006/picture">
                       <pic:pic xmlns:pic="http://schemas.openxmlformats.org/drawingml/2006/picture">
                         <pic:nvPicPr>
-                          <pic:cNvPr id="501" name="fig01_lcd_wiring.png"/>
+                          <pic:cNvPr id="502" name="fig01_lcd_wiring.png"/>
                           <pic:cNvPicPr/>
                         </pic:nvPicPr>
                         <pic:blipFill>
-                          <a:blip r:embed="rIdImg1"/>
+                          <a:blip r:embed="rIdImg2"/>
                           <a:stretch>
                             <a:fillRect/>
                           </a:stretch>
@@ -963,7 +1132,7 @@
                 <w:sz w:val="18"/>
                 <w:szCs w:val="18"/>
               </w:rPr>
-              <w:t xml:space="preserve">Figure 1: </w:t>
+              <w:t xml:space="preserve">Figure 2: </w:t>
             </w:r>
             <w:r>
               <w:rPr>
@@ -971,7 +1140,7 @@
                 <w:sz w:val="18"/>
                 <w:szCs w:val="18"/>
               </w:rPr>
-              <w:t xml:space="preserve">LCD wiring. The RGB LCD shield needs no wires: plug it onto the breakout board.</w:t>
+              <w:t xml:space="preserve">I2C backpack LCD wiring. For the RGB LCD shield, see Figure 1.</w:t>
             </w:r>
           </w:p>
         </w:tc>
@@ -1022,7 +1191,7 @@
                 <wp:inline distT="0" distB="0" distL="0" distR="0">
                   <wp:extent cx="4622250" cy="2689309"/>
                   <wp:effectExtent l="0" t="0" r="0" b="0"/>
-                  <wp:docPr id="502" name="Figure 2"/>
+                  <wp:docPr id="503" name="Figure 3"/>
                   <wp:cNvGraphicFramePr>
                     <a:graphicFrameLocks xmlns:a="http://schemas.openxmlformats.org/drawingml/2006/main" noChangeAspect="1"/>
                   </wp:cNvGraphicFramePr>
@@ -1030,11 +1199,11 @@
                     <a:graphicData uri="http://schemas.openxmlformats.org/drawingml/2006/picture">
                       <pic:pic xmlns:pic="http://schemas.openxmlformats.org/drawingml/2006/picture">
                         <pic:nvPicPr>
-                          <pic:cNvPr id="502" name="fig02_fsm_traffic.png"/>
+                          <pic:cNvPr id="503" name="fig02_fsm_traffic.png"/>
                           <pic:cNvPicPr/>
                         </pic:nvPicPr>
                         <pic:blipFill>
-                          <a:blip r:embed="rIdImg2"/>
+                          <a:blip r:embed="rIdImg3"/>
                           <a:stretch>
                             <a:fillRect/>
                           </a:stretch>
@@ -1068,7 +1237,7 @@
                 <w:sz w:val="18"/>
                 <w:szCs w:val="18"/>
               </w:rPr>
-              <w:t xml:space="preserve">Figure 2: </w:t>
+              <w:t xml:space="preserve">Figure 3: </w:t>
             </w:r>
             <w:r>
               <w:rPr>
@@ -1182,7 +1351,7 @@
             </w:r>
             <w:r>
               <w:rPr/>
-              <w:t xml:space="preserve"> (plugs on, five buttons).</w:t>
+              <w:t xml:space="preserve"> (the shield with five buttons).</w:t>
             </w:r>
           </w:p>
         </w:tc>
@@ -2750,7 +2919,7 @@
                 <wp:inline distT="0" distB="0" distL="0" distR="0">
                   <wp:extent cx="4437360" cy="5026696"/>
                   <wp:effectExtent l="0" t="0" r="0" b="0"/>
-                  <wp:docPr id="503" name="Figure 3"/>
+                  <wp:docPr id="504" name="Figure 4"/>
                   <wp:cNvGraphicFramePr>
                     <a:graphicFrameLocks xmlns:a="http://schemas.openxmlformats.org/drawingml/2006/main" noChangeAspect="1"/>
                   </wp:cNvGraphicFramePr>
@@ -2758,11 +2927,11 @@
                     <a:graphicData uri="http://schemas.openxmlformats.org/drawingml/2006/picture">
                       <pic:pic xmlns:pic="http://schemas.openxmlformats.org/drawingml/2006/picture">
                         <pic:nvPicPr>
-                          <pic:cNvPr id="503" name="fig04_task2_wiring.png"/>
+                          <pic:cNvPr id="504" name="fig04_task2_wiring.png"/>
                           <pic:cNvPicPr/>
                         </pic:nvPicPr>
                         <pic:blipFill>
-                          <a:blip r:embed="rIdImg3"/>
+                          <a:blip r:embed="rIdImg4"/>
                           <a:stretch>
                             <a:fillRect/>
                           </a:stretch>
@@ -2796,7 +2965,7 @@
                 <w:sz w:val="18"/>
                 <w:szCs w:val="18"/>
               </w:rPr>
-              <w:t xml:space="preserve">Figure 3: </w:t>
+              <w:t xml:space="preserve">Figure 4: </w:t>
             </w:r>
             <w:r>
               <w:rPr>
@@ -2855,7 +3024,7 @@
                 <wp:inline distT="0" distB="0" distL="0" distR="0">
                   <wp:extent cx="4930400" cy="1931073"/>
                   <wp:effectExtent l="0" t="0" r="0" b="0"/>
-                  <wp:docPr id="504" name="Figure 4"/>
+                  <wp:docPr id="505" name="Figure 5"/>
                   <wp:cNvGraphicFramePr>
                     <a:graphicFrameLocks xmlns:a="http://schemas.openxmlformats.org/drawingml/2006/main" noChangeAspect="1"/>
                   </wp:cNvGraphicFramePr>
@@ -2863,11 +3032,11 @@
                     <a:graphicData uri="http://schemas.openxmlformats.org/drawingml/2006/picture">
                       <pic:pic xmlns:pic="http://schemas.openxmlformats.org/drawingml/2006/picture">
                         <pic:nvPicPr>
-                          <pic:cNvPr id="504" name="fig05_task2_timing.png"/>
+                          <pic:cNvPr id="505" name="fig05_task2_timing.png"/>
                           <pic:cNvPicPr/>
                         </pic:nvPicPr>
                         <pic:blipFill>
-                          <a:blip r:embed="rIdImg4"/>
+                          <a:blip r:embed="rIdImg5"/>
                           <a:stretch>
                             <a:fillRect/>
                           </a:stretch>
@@ -2901,7 +3070,7 @@
                 <w:sz w:val="18"/>
                 <w:szCs w:val="18"/>
               </w:rPr>
-              <w:t xml:space="preserve">Figure 4: </w:t>
+              <w:t xml:space="preserve">Figure 5: </w:t>
             </w:r>
             <w:r>
               <w:rPr>
@@ -3015,7 +3184,7 @@
             </w:r>
             <w:r>
               <w:rPr/>
-              <w:t xml:space="preserve"> (plugs on, five buttons).</w:t>
+              <w:t xml:space="preserve"> (the shield with five buttons).</w:t>
             </w:r>
           </w:p>
         </w:tc>
@@ -3280,7 +3449,7 @@
       </w:r>
       <w:r>
         <w:rPr/>
-        <w:t xml:space="preserve"> for that state’s LED. Run it for two cycles. What do the LEDs show, and why? Compare with Figure 4. Then put </w:t>
+        <w:t xml:space="preserve"> for that state’s LED. Run it for two cycles. What do the LEDs show, and why? Compare with Figure 5. Then put </w:t>
       </w:r>
       <w:r>
         <w:rPr>
@@ -4038,7 +4207,7 @@
                 <wp:inline distT="0" distB="0" distL="0" distR="0">
                   <wp:extent cx="4437360" cy="5165364"/>
                   <wp:effectExtent l="0" t="0" r="0" b="0"/>
-                  <wp:docPr id="505" name="Figure 5"/>
+                  <wp:docPr id="506" name="Figure 6"/>
                   <wp:cNvGraphicFramePr>
                     <a:graphicFrameLocks xmlns:a="http://schemas.openxmlformats.org/drawingml/2006/main" noChangeAspect="1"/>
                   </wp:cNvGraphicFramePr>
@@ -4046,11 +4215,11 @@
                     <a:graphicData uri="http://schemas.openxmlformats.org/drawingml/2006/picture">
                       <pic:pic xmlns:pic="http://schemas.openxmlformats.org/drawingml/2006/picture">
                         <pic:nvPicPr>
-                          <pic:cNvPr id="505" name="fig06_task3_wiring.png"/>
+                          <pic:cNvPr id="506" name="fig06_task3_wiring.png"/>
                           <pic:cNvPicPr/>
                         </pic:nvPicPr>
                         <pic:blipFill>
-                          <a:blip r:embed="rIdImg5"/>
+                          <a:blip r:embed="rIdImg6"/>
                           <a:stretch>
                             <a:fillRect/>
                           </a:stretch>
@@ -4084,7 +4253,7 @@
                 <w:sz w:val="18"/>
                 <w:szCs w:val="18"/>
               </w:rPr>
-              <w:t xml:space="preserve">Figure 5: </w:t>
+              <w:t xml:space="preserve">Figure 6: </w:t>
             </w:r>
             <w:r>
               <w:rPr>
@@ -4143,7 +4312,7 @@
                 <wp:inline distT="0" distB="0" distL="0" distR="0">
                   <wp:extent cx="4930400" cy="2876066"/>
                   <wp:effectExtent l="0" t="0" r="0" b="0"/>
-                  <wp:docPr id="506" name="Figure 6"/>
+                  <wp:docPr id="507" name="Figure 7"/>
                   <wp:cNvGraphicFramePr>
                     <a:graphicFrameLocks xmlns:a="http://schemas.openxmlformats.org/drawingml/2006/main" noChangeAspect="1"/>
                   </wp:cNvGraphicFramePr>
@@ -4151,11 +4320,11 @@
                     <a:graphicData uri="http://schemas.openxmlformats.org/drawingml/2006/picture">
                       <pic:pic xmlns:pic="http://schemas.openxmlformats.org/drawingml/2006/picture">
                         <pic:nvPicPr>
-                          <pic:cNvPr id="506" name="fig08_fsm_crossing.png"/>
+                          <pic:cNvPr id="507" name="fig08_fsm_crossing.png"/>
                           <pic:cNvPicPr/>
                         </pic:nvPicPr>
                         <pic:blipFill>
-                          <a:blip r:embed="rIdImg6"/>
+                          <a:blip r:embed="rIdImg7"/>
                           <a:stretch>
                             <a:fillRect/>
                           </a:stretch>
@@ -4189,7 +4358,7 @@
                 <w:sz w:val="18"/>
                 <w:szCs w:val="18"/>
               </w:rPr>
-              <w:t xml:space="preserve">Figure 6: </w:t>
+              <w:t xml:space="preserve">Figure 7: </w:t>
             </w:r>
             <w:r>
               <w:rPr>
@@ -4303,7 +4472,7 @@
             </w:r>
             <w:r>
               <w:rPr/>
-              <w:t xml:space="preserve"> (plugs on, five buttons).</w:t>
+              <w:t xml:space="preserve"> (the shield with five buttons).</w:t>
             </w:r>
           </w:p>
         </w:tc>

</xml_diff>